<commit_message>
card deck queue methods added
</commit_message>
<xml_diff>
--- a/report.docx
+++ b/report.docx
@@ -1,6 +1,6 @@
 
 <file path=word/document.xml><?xml version="1.0" encoding="utf-8"?>
-<w:document xmlns:wpc="http://schemas.microsoft.com/office/word/2010/wordprocessingCanvas" xmlns:cx="http://schemas.microsoft.com/office/drawing/2014/chartex" xmlns:cx1="http://schemas.microsoft.com/office/drawing/2015/9/8/chartex" xmlns:cx2="http://schemas.microsoft.com/office/drawing/2015/10/21/chartex" xmlns:cx3="http://schemas.microsoft.com/office/drawing/2016/5/9/chartex" xmlns:cx4="http://schemas.microsoft.com/office/drawing/2016/5/10/chartex" xmlns:cx5="http://schemas.microsoft.com/office/drawing/2016/5/11/chartex" xmlns:cx6="http://schemas.microsoft.com/office/drawing/2016/5/12/chartex" xmlns:cx7="http://schemas.microsoft.com/office/drawing/2016/5/13/chartex" xmlns:cx8="http://schemas.microsoft.com/office/drawing/2016/5/14/chartex" xmlns:mc="http://schemas.openxmlformats.org/markup-compatibility/2006" xmlns:aink="http://schemas.microsoft.com/office/drawing/2016/ink" xmlns:am3d="http://schemas.microsoft.com/office/drawing/2017/model3d" xmlns:o="urn:schemas-microsoft-com:office:office" xmlns:oel="http://schemas.microsoft.com/office/2019/extlst" xmlns:r="http://schemas.openxmlformats.org/officeDocument/2006/relationships" xmlns:m="http://schemas.openxmlformats.org/officeDocument/2006/math" xmlns:v="urn:schemas-microsoft-com:vml" xmlns:wp14="http://schemas.microsoft.com/office/word/2010/wordprocessingDrawing" xmlns:wp="http://schemas.openxmlformats.org/drawingml/2006/wordprocessingDrawing" xmlns:w10="urn:schemas-microsoft-com:office:word" xmlns:w="http://schemas.openxmlformats.org/wordprocessingml/2006/main" xmlns:w14="http://schemas.microsoft.com/office/word/2010/wordml" xmlns:w15="http://schemas.microsoft.com/office/word/2012/wordml" xmlns:w16cex="http://schemas.microsoft.com/office/word/2018/wordml/cex" xmlns:w16cid="http://schemas.microsoft.com/office/word/2016/wordml/cid" xmlns:w16="http://schemas.microsoft.com/office/word/2018/wordml" xmlns:w16du="http://schemas.microsoft.com/office/word/2023/wordml/word16du" xmlns:w16sdtdh="http://schemas.microsoft.com/office/word/2020/wordml/sdtdatahash" xmlns:w16sdtfl="http://schemas.microsoft.com/office/word/2024/wordml/sdtformatlock" xmlns:w16se="http://schemas.microsoft.com/office/word/2015/wordml/symex" xmlns:wpg="http://schemas.microsoft.com/office/word/2010/wordprocessingGroup" xmlns:wpi="http://schemas.microsoft.com/office/word/2010/wordprocessingInk" xmlns:wne="http://schemas.microsoft.com/office/word/2006/wordml" xmlns:wps="http://schemas.microsoft.com/office/word/2010/wordprocessingShape" mc:Ignorable="w14 w15 w16se w16cid w16 w16cex w16sdtdh w16sdtfl w16du wp14">
+<w:document xmlns:wpc="http://schemas.microsoft.com/office/word/2010/wordprocessingCanvas" xmlns:cx="http://schemas.microsoft.com/office/drawing/2014/chartex" xmlns:cx1="http://schemas.microsoft.com/office/drawing/2015/9/8/chartex" xmlns:cx2="http://schemas.microsoft.com/office/drawing/2015/10/21/chartex" xmlns:cx3="http://schemas.microsoft.com/office/drawing/2016/5/9/chartex" xmlns:cx4="http://schemas.microsoft.com/office/drawing/2016/5/10/chartex" xmlns:cx5="http://schemas.microsoft.com/office/drawing/2016/5/11/chartex" xmlns:cx6="http://schemas.microsoft.com/office/drawing/2016/5/12/chartex" xmlns:cx7="http://schemas.microsoft.com/office/drawing/2016/5/13/chartex" xmlns:cx8="http://schemas.microsoft.com/office/drawing/2016/5/14/chartex" xmlns:mc="http://schemas.openxmlformats.org/markup-compatibility/2006" xmlns:m="http://schemas.openxmlformats.org/officeDocument/2006/math" xmlns:aink="http://schemas.microsoft.com/office/drawing/2016/ink" xmlns:am3d="http://schemas.microsoft.com/office/drawing/2017/model3d" xmlns:oel="http://schemas.microsoft.com/office/2019/extlst" xmlns:r="http://schemas.openxmlformats.org/officeDocument/2006/relationships" xmlns:wp14="http://schemas.microsoft.com/office/word/2010/wordprocessingDrawing" xmlns:wp="http://schemas.openxmlformats.org/drawingml/2006/wordprocessingDrawing" xmlns:wpg="http://schemas.microsoft.com/office/word/2010/wordprocessingGroup" xmlns:wpi="http://schemas.microsoft.com/office/word/2010/wordprocessingInk" xmlns:wps="http://schemas.microsoft.com/office/word/2010/wordprocessingShape" xmlns:o="urn:schemas-microsoft-com:office:office" xmlns:v="urn:schemas-microsoft-com:vml" xmlns:w10="urn:schemas-microsoft-com:office:word" xmlns:w="http://schemas.openxmlformats.org/wordprocessingml/2006/main" xmlns:w14="http://schemas.microsoft.com/office/word/2010/wordml" xmlns:w15="http://schemas.microsoft.com/office/word/2012/wordml" xmlns:w16cex="http://schemas.microsoft.com/office/word/2018/wordml/cex" xmlns:w16cid="http://schemas.microsoft.com/office/word/2016/wordml/cid" xmlns:w16="http://schemas.microsoft.com/office/word/2018/wordml" xmlns:w16sdtdh="http://schemas.microsoft.com/office/word/2020/wordml/sdtdatahash" xmlns:w16sdtfl="http://schemas.microsoft.com/office/word/2024/wordml/sdtformatlock" xmlns:w16se="http://schemas.microsoft.com/office/word/2015/wordml/symex" xmlns:w16du="http://schemas.microsoft.com/office/word/2023/wordml/word16du" xmlns:wne="http://schemas.microsoft.com/office/word/2006/wordml" mc:Ignorable="w14 w15 w16se w16cid w16 w16cex w16sdtdh w16sdtfl w16du wp14">
   <w:body>
     <w:p>
       <w:pPr>
@@ -57,6 +57,25 @@
           <w:lang w:val="en-US"/>
         </w:rPr>
         <w:t>Architecture</w:t>
+      </w:r>
+    </w:p>
+    <w:p>
+      <w:pPr>
+        <w:rPr>
+          <w:lang w:val="en-US"/>
+        </w:rPr>
+      </w:pPr>
+      <w:r>
+        <w:rPr>
+          <w:lang w:val="en-US"/>
+        </w:rPr>
+        <w:t xml:space="preserve">For this project we started by breaking down the problem into more simple components. We first created 4 classes that we knew we needed which were Card, Player, CardDeck and CardGame. The Card class was used to create a card object as well as store a static ArrayList called pack with all the active cards in the current game. The Card object had an integer value attribute that can be used to determine its number and therefore whether a player should keep or discard it. The Player class will be used to hold all the required player information including the player’s name as a string, the player number as an integer. It also holds 2 objects being the discard and draw decks as well as 2 static attributes, one being an integer for the number of active players and the other being a static ArrayList with all the active players in the game. </w:t>
+      </w:r>
+      <w:r>
+        <w:rPr>
+          <w:lang w:val="en-US"/>
+        </w:rPr>
+        <w:t xml:space="preserve">The CardDeck class has an ArrayList deck which is used to store all the card objects in that deck. The Class also has a deck number attribute as well as a static numOfDecks attribute which is used to increment the deck number in the constructor so no number has to be passed as an argument into the constructor. </w:t>
       </w:r>
     </w:p>
     <w:p>
@@ -437,7 +456,7 @@
 </file>
 
 <file path=word/styles.xml><?xml version="1.0" encoding="utf-8"?>
-<w:styles xmlns:mc="http://schemas.openxmlformats.org/markup-compatibility/2006" xmlns:r="http://schemas.openxmlformats.org/officeDocument/2006/relationships" xmlns:w="http://schemas.openxmlformats.org/wordprocessingml/2006/main" xmlns:w14="http://schemas.microsoft.com/office/word/2010/wordml" xmlns:w15="http://schemas.microsoft.com/office/word/2012/wordml" xmlns:w16cex="http://schemas.microsoft.com/office/word/2018/wordml/cex" xmlns:w16cid="http://schemas.microsoft.com/office/word/2016/wordml/cid" xmlns:w16="http://schemas.microsoft.com/office/word/2018/wordml" xmlns:w16du="http://schemas.microsoft.com/office/word/2023/wordml/word16du" xmlns:w16sdtdh="http://schemas.microsoft.com/office/word/2020/wordml/sdtdatahash" xmlns:w16sdtfl="http://schemas.microsoft.com/office/word/2024/wordml/sdtformatlock" xmlns:w16se="http://schemas.microsoft.com/office/word/2015/wordml/symex" mc:Ignorable="w14 w15 w16se w16cid w16 w16cex w16sdtdh w16sdtfl w16du">
+<w:styles xmlns:mc="http://schemas.openxmlformats.org/markup-compatibility/2006" xmlns:r="http://schemas.openxmlformats.org/officeDocument/2006/relationships" xmlns:w="http://schemas.openxmlformats.org/wordprocessingml/2006/main" xmlns:w14="http://schemas.microsoft.com/office/word/2010/wordml" xmlns:w15="http://schemas.microsoft.com/office/word/2012/wordml" xmlns:w16cex="http://schemas.microsoft.com/office/word/2018/wordml/cex" xmlns:w16cid="http://schemas.microsoft.com/office/word/2016/wordml/cid" xmlns:w16="http://schemas.microsoft.com/office/word/2018/wordml" xmlns:w16sdtdh="http://schemas.microsoft.com/office/word/2020/wordml/sdtdatahash" xmlns:w16sdtfl="http://schemas.microsoft.com/office/word/2024/wordml/sdtformatlock" xmlns:w16se="http://schemas.microsoft.com/office/word/2015/wordml/symex" xmlns:w16du="http://schemas.microsoft.com/office/word/2023/wordml/word16du" mc:Ignorable="w14 w15 w16se w16cid w16 w16cex w16sdtdh w16sdtfl w16du">
   <w:docDefaults>
     <w:rPrDefault>
       <w:rPr>

</xml_diff>

<commit_message>
continued with JUnit tests and fixed some of the testing errors
</commit_message>
<xml_diff>
--- a/report.docx
+++ b/report.docx
@@ -75,7 +75,52 @@
         <w:rPr>
           <w:lang w:val="en-US"/>
         </w:rPr>
-        <w:t xml:space="preserve">The CardDeck class has an ArrayList deck which is used to store all the card objects in that deck. The Class also has a deck number attribute as well as a static numOfDecks attribute which is used to increment the deck number in the constructor so no number has to be passed as an argument into the constructor. </w:t>
+        <w:t xml:space="preserve">The CardDeck class has an ArrayList deck which is used to store all the card objects in that deck. The Class also has a deck number attribute as well as a static numOfDecks attribute which is used to increment the deck number in the </w:t>
+      </w:r>
+      <w:r>
+        <w:rPr>
+          <w:lang w:val="en-US"/>
+        </w:rPr>
+        <w:t>constructor,</w:t>
+      </w:r>
+      <w:r>
+        <w:rPr>
+          <w:lang w:val="en-US"/>
+        </w:rPr>
+        <w:t xml:space="preserve"> so no number </w:t>
+      </w:r>
+      <w:proofErr w:type="gramStart"/>
+      <w:r>
+        <w:rPr>
+          <w:lang w:val="en-US"/>
+        </w:rPr>
+        <w:t>has to</w:t>
+      </w:r>
+      <w:proofErr w:type="gramEnd"/>
+      <w:r>
+        <w:rPr>
+          <w:lang w:val="en-US"/>
+        </w:rPr>
+        <w:t xml:space="preserve"> be passed as an argument into the constructor. </w:t>
+      </w:r>
+    </w:p>
+    <w:p>
+      <w:pPr>
+        <w:rPr>
+          <w:lang w:val="en-US"/>
+        </w:rPr>
+      </w:pPr>
+      <w:r>
+        <w:rPr>
+          <w:lang w:val="en-US"/>
+        </w:rPr>
+        <w:t xml:space="preserve">The CardGame class file is used to run the game however it does not hold a lot of the necessary methods to run the game which are held in the player class. The CardGame has the initialization methods for checking the </w:t>
+      </w:r>
+      <w:r>
+        <w:rPr>
+          <w:lang w:val="en-US"/>
+        </w:rPr>
+        <w:t xml:space="preserve">player inputs and the input files. It then calls the method to deal the cards and begins running the threads. </w:t>
       </w:r>
     </w:p>
     <w:p>

</xml_diff>

<commit_message>
report writing. Testing and spec satisfaction
</commit_message>
<xml_diff>
--- a/report.docx
+++ b/report.docx
@@ -1,6 +1,6 @@
 
 <file path=word/document.xml><?xml version="1.0" encoding="utf-8"?>
-<w:document xmlns:wpc="http://schemas.microsoft.com/office/word/2010/wordprocessingCanvas" xmlns:cx="http://schemas.microsoft.com/office/drawing/2014/chartex" xmlns:cx1="http://schemas.microsoft.com/office/drawing/2015/9/8/chartex" xmlns:cx2="http://schemas.microsoft.com/office/drawing/2015/10/21/chartex" xmlns:cx3="http://schemas.microsoft.com/office/drawing/2016/5/9/chartex" xmlns:cx4="http://schemas.microsoft.com/office/drawing/2016/5/10/chartex" xmlns:cx5="http://schemas.microsoft.com/office/drawing/2016/5/11/chartex" xmlns:cx6="http://schemas.microsoft.com/office/drawing/2016/5/12/chartex" xmlns:cx7="http://schemas.microsoft.com/office/drawing/2016/5/13/chartex" xmlns:cx8="http://schemas.microsoft.com/office/drawing/2016/5/14/chartex" xmlns:mc="http://schemas.openxmlformats.org/markup-compatibility/2006" xmlns:aink="http://schemas.microsoft.com/office/drawing/2016/ink" xmlns:am3d="http://schemas.microsoft.com/office/drawing/2017/model3d" xmlns:o="urn:schemas-microsoft-com:office:office" xmlns:oel="http://schemas.microsoft.com/office/2019/extlst" xmlns:r="http://schemas.openxmlformats.org/officeDocument/2006/relationships" xmlns:m="http://schemas.openxmlformats.org/officeDocument/2006/math" xmlns:v="urn:schemas-microsoft-com:vml" xmlns:wp14="http://schemas.microsoft.com/office/word/2010/wordprocessingDrawing" xmlns:wp="http://schemas.openxmlformats.org/drawingml/2006/wordprocessingDrawing" xmlns:w10="urn:schemas-microsoft-com:office:word" xmlns:w="http://schemas.openxmlformats.org/wordprocessingml/2006/main" xmlns:w14="http://schemas.microsoft.com/office/word/2010/wordml" xmlns:w15="http://schemas.microsoft.com/office/word/2012/wordml" xmlns:w16cex="http://schemas.microsoft.com/office/word/2018/wordml/cex" xmlns:w16cid="http://schemas.microsoft.com/office/word/2016/wordml/cid" xmlns:w16="http://schemas.microsoft.com/office/word/2018/wordml" xmlns:w16du="http://schemas.microsoft.com/office/word/2023/wordml/word16du" xmlns:w16sdtdh="http://schemas.microsoft.com/office/word/2020/wordml/sdtdatahash" xmlns:w16sdtfl="http://schemas.microsoft.com/office/word/2024/wordml/sdtformatlock" xmlns:w16se="http://schemas.microsoft.com/office/word/2015/wordml/symex" xmlns:wpg="http://schemas.microsoft.com/office/word/2010/wordprocessingGroup" xmlns:wpi="http://schemas.microsoft.com/office/word/2010/wordprocessingInk" xmlns:wne="http://schemas.microsoft.com/office/word/2006/wordml" xmlns:wps="http://schemas.microsoft.com/office/word/2010/wordprocessingShape" mc:Ignorable="w14 w15 w16se w16cid w16 w16cex w16sdtdh w16sdtfl w16du wp14">
+<w:document xmlns:wpc="http://schemas.microsoft.com/office/word/2010/wordprocessingCanvas" xmlns:cx="http://schemas.microsoft.com/office/drawing/2014/chartex" xmlns:cx1="http://schemas.microsoft.com/office/drawing/2015/9/8/chartex" xmlns:cx2="http://schemas.microsoft.com/office/drawing/2015/10/21/chartex" xmlns:cx3="http://schemas.microsoft.com/office/drawing/2016/5/9/chartex" xmlns:cx4="http://schemas.microsoft.com/office/drawing/2016/5/10/chartex" xmlns:cx5="http://schemas.microsoft.com/office/drawing/2016/5/11/chartex" xmlns:cx6="http://schemas.microsoft.com/office/drawing/2016/5/12/chartex" xmlns:cx7="http://schemas.microsoft.com/office/drawing/2016/5/13/chartex" xmlns:cx8="http://schemas.microsoft.com/office/drawing/2016/5/14/chartex" xmlns:mc="http://schemas.openxmlformats.org/markup-compatibility/2006" xmlns:m="http://schemas.openxmlformats.org/officeDocument/2006/math" xmlns:aink="http://schemas.microsoft.com/office/drawing/2016/ink" xmlns:am3d="http://schemas.microsoft.com/office/drawing/2017/model3d" xmlns:oel="http://schemas.microsoft.com/office/2019/extlst" xmlns:r="http://schemas.openxmlformats.org/officeDocument/2006/relationships" xmlns:wp14="http://schemas.microsoft.com/office/word/2010/wordprocessingDrawing" xmlns:wp="http://schemas.openxmlformats.org/drawingml/2006/wordprocessingDrawing" xmlns:wpg="http://schemas.microsoft.com/office/word/2010/wordprocessingGroup" xmlns:wpi="http://schemas.microsoft.com/office/word/2010/wordprocessingInk" xmlns:wps="http://schemas.microsoft.com/office/word/2010/wordprocessingShape" xmlns:o="urn:schemas-microsoft-com:office:office" xmlns:v="urn:schemas-microsoft-com:vml" xmlns:w10="urn:schemas-microsoft-com:office:word" xmlns:w="http://schemas.openxmlformats.org/wordprocessingml/2006/main" xmlns:w14="http://schemas.microsoft.com/office/word/2010/wordml" xmlns:w15="http://schemas.microsoft.com/office/word/2012/wordml" xmlns:w16cex="http://schemas.microsoft.com/office/word/2018/wordml/cex" xmlns:w16cid="http://schemas.microsoft.com/office/word/2016/wordml/cid" xmlns:w16="http://schemas.microsoft.com/office/word/2018/wordml" xmlns:w16sdtdh="http://schemas.microsoft.com/office/word/2020/wordml/sdtdatahash" xmlns:w16sdtfl="http://schemas.microsoft.com/office/word/2024/wordml/sdtformatlock" xmlns:w16se="http://schemas.microsoft.com/office/word/2015/wordml/symex" xmlns:w16du="http://schemas.microsoft.com/office/word/2023/wordml/word16du" xmlns:wne="http://schemas.microsoft.com/office/word/2006/wordml" mc:Ignorable="w14 w15 w16se w16cid w16 w16cex w16sdtdh w16sdtfl w16du wp14">
   <w:body>
     <w:p>
       <w:pPr>
@@ -179,7 +179,14 @@
         <w:rPr>
           <w:lang w:val="en-US"/>
         </w:rPr>
-        <w:t>Our solution heavily uses encapsulation to privati</w:t>
+        <w:t xml:space="preserve">Our solution heavily uses encapsulation to </w:t>
+      </w:r>
+      <w:proofErr w:type="spellStart"/>
+      <w:r>
+        <w:rPr>
+          <w:lang w:val="en-US"/>
+        </w:rPr>
+        <w:t>privati</w:t>
       </w:r>
       <w:r>
         <w:rPr>
@@ -193,6 +200,7 @@
         </w:rPr>
         <w:t>e</w:t>
       </w:r>
+      <w:proofErr w:type="spellEnd"/>
       <w:r>
         <w:rPr>
           <w:lang w:val="en-US"/>
@@ -240,7 +248,21 @@
         <w:rPr>
           <w:lang w:val="en-US"/>
         </w:rPr>
-        <w:t xml:space="preserve">. Both Player and CardDeck have a method defined as writeToFile which are used to write to </w:t>
+        <w:t xml:space="preserve">. Both Player and CardDeck have a method defined as </w:t>
+      </w:r>
+      <w:proofErr w:type="spellStart"/>
+      <w:r>
+        <w:rPr>
+          <w:lang w:val="en-US"/>
+        </w:rPr>
+        <w:t>writeToFile</w:t>
+      </w:r>
+      <w:proofErr w:type="spellEnd"/>
+      <w:r>
+        <w:rPr>
+          <w:lang w:val="en-US"/>
+        </w:rPr>
+        <w:t xml:space="preserve"> which are used to write to </w:t>
       </w:r>
       <w:r>
         <w:rPr>
@@ -260,11 +282,19 @@
         </w:rPr>
         <w:t xml:space="preserve"> We have also implemented a method called </w:t>
       </w:r>
-      <w:r>
-        <w:rPr>
-          <w:lang w:val="en-US"/>
-        </w:rPr>
-        <w:t xml:space="preserve">resetForTests </w:t>
+      <w:proofErr w:type="spellStart"/>
+      <w:r>
+        <w:rPr>
+          <w:lang w:val="en-US"/>
+        </w:rPr>
+        <w:t>resetForTests</w:t>
+      </w:r>
+      <w:proofErr w:type="spellEnd"/>
+      <w:r>
+        <w:rPr>
+          <w:lang w:val="en-US"/>
+        </w:rPr>
+        <w:t xml:space="preserve"> </w:t>
       </w:r>
       <w:r>
         <w:rPr>
@@ -405,7 +435,21 @@
         <w:rPr>
           <w:lang w:val="en-US"/>
         </w:rPr>
-        <w:t>As previously mentioned players extend the thread class to</w:t>
+        <w:t xml:space="preserve">As previously </w:t>
+      </w:r>
+      <w:proofErr w:type="gramStart"/>
+      <w:r>
+        <w:rPr>
+          <w:lang w:val="en-US"/>
+        </w:rPr>
+        <w:t>mentioned</w:t>
+      </w:r>
+      <w:proofErr w:type="gramEnd"/>
+      <w:r>
+        <w:rPr>
+          <w:lang w:val="en-US"/>
+        </w:rPr>
+        <w:t xml:space="preserve"> players extend the thread class to</w:t>
       </w:r>
       <w:r>
         <w:rPr>
@@ -453,13 +497,63 @@
         <w:rPr>
           <w:lang w:val="en-US"/>
         </w:rPr>
-        <w:t xml:space="preserve"> at the same time. These methods are drawAndDiscard() and checkWinState(). By making the method for drawing and discarding</w:t>
-      </w:r>
-      <w:r>
-        <w:rPr>
-          <w:lang w:val="en-US"/>
-        </w:rPr>
-        <w:t xml:space="preserve"> synchronized, both of these actions are treated as one atomic action when</w:t>
+        <w:t xml:space="preserve"> at the same time. These methods are </w:t>
+      </w:r>
+      <w:proofErr w:type="gramStart"/>
+      <w:r>
+        <w:rPr>
+          <w:lang w:val="en-US"/>
+        </w:rPr>
+        <w:t>drawAndDiscard(</w:t>
+      </w:r>
+      <w:proofErr w:type="gramEnd"/>
+      <w:r>
+        <w:rPr>
+          <w:lang w:val="en-US"/>
+        </w:rPr>
+        <w:t xml:space="preserve">) and </w:t>
+      </w:r>
+      <w:proofErr w:type="spellStart"/>
+      <w:proofErr w:type="gramStart"/>
+      <w:r>
+        <w:rPr>
+          <w:lang w:val="en-US"/>
+        </w:rPr>
+        <w:t>checkWinState</w:t>
+      </w:r>
+      <w:proofErr w:type="spellEnd"/>
+      <w:r>
+        <w:rPr>
+          <w:lang w:val="en-US"/>
+        </w:rPr>
+        <w:t>(</w:t>
+      </w:r>
+      <w:proofErr w:type="gramEnd"/>
+      <w:r>
+        <w:rPr>
+          <w:lang w:val="en-US"/>
+        </w:rPr>
+        <w:t>). By making the method for drawing and discarding</w:t>
+      </w:r>
+      <w:r>
+        <w:rPr>
+          <w:lang w:val="en-US"/>
+        </w:rPr>
+        <w:t xml:space="preserve"> synchronized, </w:t>
+      </w:r>
+      <w:proofErr w:type="gramStart"/>
+      <w:r>
+        <w:rPr>
+          <w:lang w:val="en-US"/>
+        </w:rPr>
+        <w:t>both of these</w:t>
+      </w:r>
+      <w:proofErr w:type="gramEnd"/>
+      <w:r>
+        <w:rPr>
+          <w:lang w:val="en-US"/>
+        </w:rPr>
+        <w:t xml:space="preserve"> actions are treated as one atomic action when</w:t>
       </w:r>
       <w:r>
         <w:rPr>
@@ -477,13 +571,27 @@
         <w:rPr>
           <w:lang w:val="en-US"/>
         </w:rPr>
-        <w:t xml:space="preserve"> this means that a </w:t>
-      </w:r>
-      <w:r>
-        <w:rPr>
-          <w:lang w:val="en-US"/>
-        </w:rPr>
-        <w:t xml:space="preserve"> player can’t be interrupted whilst it is drawing and discarding.</w:t>
+        <w:t xml:space="preserve"> this means that </w:t>
+      </w:r>
+      <w:proofErr w:type="gramStart"/>
+      <w:r>
+        <w:rPr>
+          <w:lang w:val="en-US"/>
+        </w:rPr>
+        <w:t xml:space="preserve">a </w:t>
+      </w:r>
+      <w:r>
+        <w:rPr>
+          <w:lang w:val="en-US"/>
+        </w:rPr>
+        <w:t xml:space="preserve"> player</w:t>
+      </w:r>
+      <w:proofErr w:type="gramEnd"/>
+      <w:r>
+        <w:rPr>
+          <w:lang w:val="en-US"/>
+        </w:rPr>
+        <w:t xml:space="preserve"> can’t be interrupted whilst it is drawing and discarding.</w:t>
       </w:r>
     </w:p>
     <w:p>
@@ -504,17 +612,47 @@
         </w:rPr>
         <w:t xml:space="preserve">used a static </w:t>
       </w:r>
-      <w:r>
-        <w:rPr>
-          <w:lang w:val="en-US"/>
-        </w:rPr>
-        <w:t>CyclicBarrier object, import</w:t>
-      </w:r>
-      <w:r>
-        <w:rPr>
-          <w:lang w:val="en-US"/>
-        </w:rPr>
-        <w:t>ed from the java.util.concurrent library</w:t>
+      <w:proofErr w:type="spellStart"/>
+      <w:r>
+        <w:rPr>
+          <w:lang w:val="en-US"/>
+        </w:rPr>
+        <w:t>CyclicBarrier</w:t>
+      </w:r>
+      <w:proofErr w:type="spellEnd"/>
+      <w:r>
+        <w:rPr>
+          <w:lang w:val="en-US"/>
+        </w:rPr>
+        <w:t xml:space="preserve"> object, import</w:t>
+      </w:r>
+      <w:r>
+        <w:rPr>
+          <w:lang w:val="en-US"/>
+        </w:rPr>
+        <w:t xml:space="preserve">ed from the </w:t>
+      </w:r>
+      <w:proofErr w:type="spellStart"/>
+      <w:proofErr w:type="gramStart"/>
+      <w:r>
+        <w:rPr>
+          <w:lang w:val="en-US"/>
+        </w:rPr>
+        <w:t>java.util</w:t>
+      </w:r>
+      <w:proofErr w:type="gramEnd"/>
+      <w:r>
+        <w:rPr>
+          <w:lang w:val="en-US"/>
+        </w:rPr>
+        <w:t>.concurrent</w:t>
+      </w:r>
+      <w:proofErr w:type="spellEnd"/>
+      <w:r>
+        <w:rPr>
+          <w:lang w:val="en-US"/>
+        </w:rPr>
+        <w:t xml:space="preserve"> library</w:t>
       </w:r>
       <w:r>
         <w:rPr>
@@ -532,7 +670,21 @@
         <w:rPr>
           <w:lang w:val="en-US"/>
         </w:rPr>
-        <w:t>player concurrency and the overall flow of the game. CyclicBarrier objects allow</w:t>
+        <w:t xml:space="preserve">player concurrency and the overall flow of the game. </w:t>
+      </w:r>
+      <w:proofErr w:type="spellStart"/>
+      <w:r>
+        <w:rPr>
+          <w:lang w:val="en-US"/>
+        </w:rPr>
+        <w:t>CyclicBarrier</w:t>
+      </w:r>
+      <w:proofErr w:type="spellEnd"/>
+      <w:r>
+        <w:rPr>
+          <w:lang w:val="en-US"/>
+        </w:rPr>
+        <w:t xml:space="preserve"> objects allow</w:t>
       </w:r>
       <w:r>
         <w:rPr>
@@ -550,20 +702,56 @@
         <w:rPr>
           <w:lang w:val="en-US"/>
         </w:rPr>
-        <w:t xml:space="preserve"> We used this in the run() method after the draw and discard step. This is so that all players draw and discard before </w:t>
-      </w:r>
-      <w:r>
-        <w:rPr>
-          <w:lang w:val="en-US"/>
-        </w:rPr>
-        <w:t>a player can draw and discard again. Using a CyclicBarrier has meant that the</w:t>
-      </w:r>
-      <w:r>
-        <w:rPr>
-          <w:lang w:val="en-US"/>
-        </w:rPr>
-        <w:t xml:space="preserve"> decks remain fairly balanced</w:t>
-      </w:r>
+        <w:t xml:space="preserve"> We used this in the </w:t>
+      </w:r>
+      <w:proofErr w:type="gramStart"/>
+      <w:r>
+        <w:rPr>
+          <w:lang w:val="en-US"/>
+        </w:rPr>
+        <w:t>run(</w:t>
+      </w:r>
+      <w:proofErr w:type="gramEnd"/>
+      <w:r>
+        <w:rPr>
+          <w:lang w:val="en-US"/>
+        </w:rPr>
+        <w:t xml:space="preserve">) method after the draw and discard step. This is so that all players draw and discard before </w:t>
+      </w:r>
+      <w:r>
+        <w:rPr>
+          <w:lang w:val="en-US"/>
+        </w:rPr>
+        <w:t xml:space="preserve">a player can draw and discard again. Using a </w:t>
+      </w:r>
+      <w:proofErr w:type="spellStart"/>
+      <w:r>
+        <w:rPr>
+          <w:lang w:val="en-US"/>
+        </w:rPr>
+        <w:t>CyclicBarrier</w:t>
+      </w:r>
+      <w:proofErr w:type="spellEnd"/>
+      <w:r>
+        <w:rPr>
+          <w:lang w:val="en-US"/>
+        </w:rPr>
+        <w:t xml:space="preserve"> has meant that the</w:t>
+      </w:r>
+      <w:r>
+        <w:rPr>
+          <w:lang w:val="en-US"/>
+        </w:rPr>
+        <w:t xml:space="preserve"> decks remain </w:t>
+      </w:r>
+      <w:proofErr w:type="gramStart"/>
+      <w:r>
+        <w:rPr>
+          <w:lang w:val="en-US"/>
+        </w:rPr>
+        <w:t>fairly balanced</w:t>
+      </w:r>
+      <w:proofErr w:type="gramEnd"/>
       <w:r>
         <w:rPr>
           <w:lang w:val="en-US"/>
@@ -632,64 +820,222 @@
     </w:p>
     <w:p>
       <w:pPr>
-        <w:rPr>
-          <w:lang w:val="en-US"/>
-        </w:rPr>
-      </w:pPr>
-      <w:r>
-        <w:rPr>
-          <w:lang w:val="en-US"/>
-        </w:rPr>
-        <w:t xml:space="preserve">To test our </w:t>
-      </w:r>
-      <w:r>
-        <w:rPr>
-          <w:lang w:val="en-US"/>
-        </w:rPr>
-        <w:t>project,</w:t>
-      </w:r>
-      <w:r>
-        <w:rPr>
-          <w:lang w:val="en-US"/>
-        </w:rPr>
-        <w:t xml:space="preserve"> we decided to use Junit 5 to test the individual modules of our code and see how it behaves. We used Junit as we could use assertions to compare our assumptions with what the actual code </w:t>
-      </w:r>
-      <w:r>
-        <w:rPr>
-          <w:lang w:val="en-US"/>
-        </w:rPr>
-        <w:t xml:space="preserve">to see if the code behaved in the desired way. </w:t>
-      </w:r>
-    </w:p>
-    <w:p>
-      <w:pPr>
-        <w:rPr>
-          <w:lang w:val="en-US"/>
-        </w:rPr>
-      </w:pPr>
-      <w:r>
-        <w:rPr>
-          <w:lang w:val="en-US"/>
-        </w:rPr>
-        <w:t>The first test that we did was the drawAndDiscard test which</w:t>
-      </w:r>
-      <w:r>
-        <w:rPr>
-          <w:lang w:val="en-US"/>
-        </w:rPr>
-        <w:t xml:space="preserve"> is used to check that when a player calls the draw and discard method, a card is removed from the draw deck and added to the discard deck from the hand. It sets up the draw deck with 4 cards and the hand with 4 cards, then calls the draw and discard method. It uses 3 assertion statements to check that the hand has 4 cards, the draw deck loses 1 </w:t>
-      </w:r>
-      <w:r>
-        <w:rPr>
-          <w:lang w:val="en-US"/>
-        </w:rPr>
-        <w:t>card,</w:t>
-      </w:r>
-      <w:r>
-        <w:rPr>
-          <w:lang w:val="en-US"/>
-        </w:rPr>
-        <w:t xml:space="preserve"> and the discard deck gains one card. </w:t>
+        <w:autoSpaceDE w:val="0"/>
+        <w:autoSpaceDN w:val="0"/>
+        <w:adjustRightInd w:val="0"/>
+        <w:spacing w:after="0" w:line="240" w:lineRule="auto"/>
+        <w:rPr>
+          <w:rFonts w:cs="AppleSystemUIFont"/>
+          <w:kern w:val="0"/>
+        </w:rPr>
+      </w:pPr>
+      <w:r>
+        <w:rPr>
+          <w:rFonts w:cs="AppleSystemUIFont"/>
+          <w:kern w:val="0"/>
+        </w:rPr>
+        <w:t xml:space="preserve">To test our project, we decided to use Junit 5 to test the individual modules of our code and see how it behaves. We used Junit as we could use assertions to compare our assumptions with what the actual code to see if the code behaved in the desired way. </w:t>
+      </w:r>
+    </w:p>
+    <w:p>
+      <w:pPr>
+        <w:autoSpaceDE w:val="0"/>
+        <w:autoSpaceDN w:val="0"/>
+        <w:adjustRightInd w:val="0"/>
+        <w:spacing w:after="0" w:line="240" w:lineRule="auto"/>
+        <w:rPr>
+          <w:rFonts w:cs="AppleSystemUIFont"/>
+          <w:kern w:val="0"/>
+        </w:rPr>
+      </w:pPr>
+      <w:proofErr w:type="spellStart"/>
+      <w:r>
+        <w:rPr>
+          <w:rFonts w:cs="AppleSystemUIFont"/>
+          <w:kern w:val="0"/>
+        </w:rPr>
+        <w:t>DrawAndDiscardTest</w:t>
+      </w:r>
+      <w:proofErr w:type="spellEnd"/>
+      <w:r>
+        <w:rPr>
+          <w:rFonts w:cs="AppleSystemUIFont"/>
+          <w:kern w:val="0"/>
+        </w:rPr>
+        <w:t xml:space="preserve">: this was used to check that when a player calls the draw and discard method, a card is removed from the draw deck and added to the discard deck from the hand. It sets up the draw deck with 4 cards and the hand with 4 cards, then calls the draw and discard method. It uses 3 assertion statements to check that the hand has 4 cards, the draw deck loses 1 card, and the discard deck gains one card. </w:t>
+      </w:r>
+    </w:p>
+    <w:p>
+      <w:pPr>
+        <w:autoSpaceDE w:val="0"/>
+        <w:autoSpaceDN w:val="0"/>
+        <w:adjustRightInd w:val="0"/>
+        <w:spacing w:after="0" w:line="240" w:lineRule="auto"/>
+        <w:rPr>
+          <w:rFonts w:cs="AppleSystemUIFont"/>
+          <w:kern w:val="0"/>
+        </w:rPr>
+      </w:pPr>
+      <w:proofErr w:type="spellStart"/>
+      <w:r>
+        <w:rPr>
+          <w:rFonts w:cs="AppleSystemUIFont"/>
+          <w:kern w:val="0"/>
+        </w:rPr>
+        <w:t>CleanTerminationTest</w:t>
+      </w:r>
+      <w:proofErr w:type="spellEnd"/>
+      <w:r>
+        <w:rPr>
+          <w:rFonts w:cs="AppleSystemUIFont"/>
+          <w:kern w:val="0"/>
+        </w:rPr>
+        <w:t xml:space="preserve">: this tested that the code terminates cleanly using a Junit test. This test sets up a scenario where there are 2 players and after one draw and discard action player 1 will win. We tested this using several assertion statements to verify the threads are interrupted and that the output text files have been created and are not empty. </w:t>
+      </w:r>
+    </w:p>
+    <w:p>
+      <w:pPr>
+        <w:autoSpaceDE w:val="0"/>
+        <w:autoSpaceDN w:val="0"/>
+        <w:adjustRightInd w:val="0"/>
+        <w:spacing w:after="0" w:line="240" w:lineRule="auto"/>
+        <w:rPr>
+          <w:rFonts w:cs="AppleSystemUIFont"/>
+          <w:kern w:val="0"/>
+        </w:rPr>
+      </w:pPr>
+      <w:proofErr w:type="spellStart"/>
+      <w:r>
+        <w:rPr>
+          <w:rFonts w:cs="AppleSystemUIFont"/>
+          <w:kern w:val="0"/>
+        </w:rPr>
+        <w:t>CardConservationTest</w:t>
+      </w:r>
+      <w:proofErr w:type="spellEnd"/>
+      <w:r>
+        <w:rPr>
+          <w:rFonts w:cs="AppleSystemUIFont"/>
+          <w:kern w:val="0"/>
+        </w:rPr>
+        <w:t>: this tested to make sure that during the running of the game the card objects are not lost are always stored inside a data structure. We did this by creating a scenario with 2 players who each have 2 cards in their hand and 2 decks. We then called the draw and discard method and checked the size of each player’s hand to ensure that they remained the same and no cards were lost.</w:t>
+      </w:r>
+    </w:p>
+    <w:p>
+      <w:pPr>
+        <w:autoSpaceDE w:val="0"/>
+        <w:autoSpaceDN w:val="0"/>
+        <w:adjustRightInd w:val="0"/>
+        <w:spacing w:after="0" w:line="240" w:lineRule="auto"/>
+        <w:rPr>
+          <w:rFonts w:cs="AppleSystemUIFont"/>
+          <w:kern w:val="0"/>
+        </w:rPr>
+      </w:pPr>
+      <w:proofErr w:type="spellStart"/>
+      <w:r>
+        <w:rPr>
+          <w:rFonts w:cs="AppleSystemUIFont"/>
+          <w:kern w:val="0"/>
+        </w:rPr>
+        <w:t>EnqueueAndDequeueTest</w:t>
+      </w:r>
+      <w:proofErr w:type="spellEnd"/>
+      <w:r>
+        <w:rPr>
+          <w:rFonts w:cs="AppleSystemUIFont"/>
+          <w:kern w:val="0"/>
+        </w:rPr>
+        <w:t xml:space="preserve">: this test the enqueue and dequeue </w:t>
+      </w:r>
+      <w:proofErr w:type="spellStart"/>
+      <w:r>
+        <w:rPr>
+          <w:rFonts w:cs="AppleSystemUIFont"/>
+          <w:kern w:val="0"/>
+        </w:rPr>
+        <w:t>behavior</w:t>
+      </w:r>
+      <w:proofErr w:type="spellEnd"/>
+      <w:r>
+        <w:rPr>
+          <w:rFonts w:cs="AppleSystemUIFont"/>
+          <w:kern w:val="0"/>
+        </w:rPr>
+        <w:t xml:space="preserve"> of the decks to ensure they functioned like a queue structure. We did this by adding cards to the decks and ensuring the first card added remained at the front and removing cards and ensuring the first card removed was at the front.</w:t>
+      </w:r>
+    </w:p>
+    <w:p>
+      <w:pPr>
+        <w:autoSpaceDE w:val="0"/>
+        <w:autoSpaceDN w:val="0"/>
+        <w:adjustRightInd w:val="0"/>
+        <w:spacing w:after="0" w:line="240" w:lineRule="auto"/>
+        <w:rPr>
+          <w:rFonts w:cs="AppleSystemUIFont"/>
+          <w:kern w:val="0"/>
+        </w:rPr>
+      </w:pPr>
+      <w:proofErr w:type="spellStart"/>
+      <w:r>
+        <w:rPr>
+          <w:rFonts w:cs="AppleSystemUIFont"/>
+          <w:kern w:val="0"/>
+        </w:rPr>
+        <w:t>InstantWinTest</w:t>
+      </w:r>
+      <w:proofErr w:type="spellEnd"/>
+      <w:r>
+        <w:rPr>
+          <w:rFonts w:cs="AppleSystemUIFont"/>
+          <w:kern w:val="0"/>
+        </w:rPr>
+        <w:t>: this tested the condition where a player was delt a winning hand at the start of the game. We tested this with both the players preferred number and another number. We checked this condition by reading the output file and ensuring that the player wins before any draw and discard methods are called.</w:t>
+      </w:r>
+    </w:p>
+    <w:p>
+      <w:pPr>
+        <w:autoSpaceDE w:val="0"/>
+        <w:autoSpaceDN w:val="0"/>
+        <w:adjustRightInd w:val="0"/>
+        <w:spacing w:after="0" w:line="240" w:lineRule="auto"/>
+        <w:rPr>
+          <w:rFonts w:cs="AppleSystemUIFont"/>
+          <w:kern w:val="0"/>
+        </w:rPr>
+      </w:pPr>
+      <w:proofErr w:type="spellStart"/>
+      <w:r>
+        <w:rPr>
+          <w:rFonts w:cs="AppleSystemUIFont"/>
+          <w:kern w:val="0"/>
+        </w:rPr>
+        <w:lastRenderedPageBreak/>
+        <w:t>PreferredDenominationTest</w:t>
+      </w:r>
+      <w:proofErr w:type="spellEnd"/>
+      <w:r>
+        <w:rPr>
+          <w:rFonts w:cs="AppleSystemUIFont"/>
+          <w:kern w:val="0"/>
+        </w:rPr>
+        <w:t xml:space="preserve">: this tested to ensure that player1 would prefer to keep cards with the value 1. We tested this by allowing player1 to discard other cards that are not 1 and then keep cards that were 1. </w:t>
+      </w:r>
+    </w:p>
+    <w:p>
+      <w:pPr>
+        <w:rPr>
+          <w:sz w:val="20"/>
+          <w:szCs w:val="20"/>
+          <w:lang w:val="en-US"/>
+        </w:rPr>
+      </w:pPr>
+      <w:r>
+        <w:rPr>
+          <w:rFonts w:cs="AppleSystemUIFont"/>
+          <w:kern w:val="0"/>
+        </w:rPr>
+        <w:t>Additional testing: we also tested our program throughout development by printing to the console as well as testing our code with larger numbers of players and varying input sizes.</w:t>
       </w:r>
     </w:p>
     <w:p>
@@ -816,7 +1162,21 @@
         <w:rPr>
           <w:lang w:val="en-US"/>
         </w:rPr>
-        <w:t xml:space="preserve"> a game with 50 players. Larger numbers of players have not been tested but we can assumed based on 50 players that</w:t>
+        <w:t xml:space="preserve"> a game with 50 players. Larger numbers of players have not been tested but we can </w:t>
+      </w:r>
+      <w:proofErr w:type="gramStart"/>
+      <w:r>
+        <w:rPr>
+          <w:lang w:val="en-US"/>
+        </w:rPr>
+        <w:t>assumed</w:t>
+      </w:r>
+      <w:proofErr w:type="gramEnd"/>
+      <w:r>
+        <w:rPr>
+          <w:lang w:val="en-US"/>
+        </w:rPr>
+        <w:t xml:space="preserve"> based on 50 players that</w:t>
       </w:r>
       <w:r>
         <w:rPr>
@@ -845,7 +1205,6 @@
           <w:u w:val="single"/>
           <w:lang w:val="en-US"/>
         </w:rPr>
-        <w:lastRenderedPageBreak/>
         <w:t>Satisfaction of specification</w:t>
       </w:r>
     </w:p>
@@ -854,12 +1213,40 @@
         <w:rPr>
           <w:b/>
           <w:bCs/>
-          <w:sz w:val="28"/>
-          <w:szCs w:val="28"/>
-          <w:u w:val="single"/>
-          <w:lang w:val="en-US"/>
-        </w:rPr>
-      </w:pPr>
+          <w:u w:val="single"/>
+          <w:lang w:val="en-US"/>
+        </w:rPr>
+      </w:pPr>
+      <w:r>
+        <w:rPr>
+          <w:rFonts w:cs="AppleSystemUIFont"/>
+          <w:kern w:val="0"/>
+        </w:rPr>
+        <w:t xml:space="preserve">To satisfy the specification for this project we needed to produce a multithreaded card game, supported by a suite of tests and documentation. We satisfied the multithreading requirement by creating a separate thread for each player with a synchronized draw and discard method ensure that each draw and discard is an atomic action which cannot be interrupted. The game follows the required ring structure with each player drawing from and discarding to the correct decks with each deck operating as a FIFO queue. Each player is dealt the correct number of cards and preferers cards which match their player number. To prevent the game stagnating the player hand also operates like a queue with cards removed from the front and added to the back. The game takes the number of players and input text file in the console and then outputs the required player and deck information to the correct output files. These </w:t>
+      </w:r>
+      <w:proofErr w:type="spellStart"/>
+      <w:r>
+        <w:rPr>
+          <w:rFonts w:cs="AppleSystemUIFont"/>
+          <w:kern w:val="0"/>
+        </w:rPr>
+        <w:t>behaviors</w:t>
+      </w:r>
+      <w:proofErr w:type="spellEnd"/>
+      <w:r>
+        <w:rPr>
+          <w:rFonts w:cs="AppleSystemUIFont"/>
+          <w:kern w:val="0"/>
+        </w:rPr>
+        <w:t xml:space="preserve"> are verified by our thorough Junit tests as well as other tests we have performed</w:t>
+      </w:r>
+      <w:r>
+        <w:rPr>
+          <w:rFonts w:cs="AppleSystemUIFont"/>
+          <w:kern w:val="0"/>
+        </w:rPr>
+        <w:t>.</w:t>
+      </w:r>
     </w:p>
     <w:p>
       <w:pPr>
@@ -1112,7 +1499,7 @@
 </file>
 
 <file path=word/styles.xml><?xml version="1.0" encoding="utf-8"?>
-<w:styles xmlns:mc="http://schemas.openxmlformats.org/markup-compatibility/2006" xmlns:r="http://schemas.openxmlformats.org/officeDocument/2006/relationships" xmlns:w="http://schemas.openxmlformats.org/wordprocessingml/2006/main" xmlns:w14="http://schemas.microsoft.com/office/word/2010/wordml" xmlns:w15="http://schemas.microsoft.com/office/word/2012/wordml" xmlns:w16cex="http://schemas.microsoft.com/office/word/2018/wordml/cex" xmlns:w16cid="http://schemas.microsoft.com/office/word/2016/wordml/cid" xmlns:w16="http://schemas.microsoft.com/office/word/2018/wordml" xmlns:w16du="http://schemas.microsoft.com/office/word/2023/wordml/word16du" xmlns:w16sdtdh="http://schemas.microsoft.com/office/word/2020/wordml/sdtdatahash" xmlns:w16sdtfl="http://schemas.microsoft.com/office/word/2024/wordml/sdtformatlock" xmlns:w16se="http://schemas.microsoft.com/office/word/2015/wordml/symex" mc:Ignorable="w14 w15 w16se w16cid w16 w16cex w16sdtdh w16sdtfl w16du">
+<w:styles xmlns:mc="http://schemas.openxmlformats.org/markup-compatibility/2006" xmlns:r="http://schemas.openxmlformats.org/officeDocument/2006/relationships" xmlns:w="http://schemas.openxmlformats.org/wordprocessingml/2006/main" xmlns:w14="http://schemas.microsoft.com/office/word/2010/wordml" xmlns:w15="http://schemas.microsoft.com/office/word/2012/wordml" xmlns:w16cex="http://schemas.microsoft.com/office/word/2018/wordml/cex" xmlns:w16cid="http://schemas.microsoft.com/office/word/2016/wordml/cid" xmlns:w16="http://schemas.microsoft.com/office/word/2018/wordml" xmlns:w16sdtdh="http://schemas.microsoft.com/office/word/2020/wordml/sdtdatahash" xmlns:w16sdtfl="http://schemas.microsoft.com/office/word/2024/wordml/sdtformatlock" xmlns:w16se="http://schemas.microsoft.com/office/word/2015/wordml/symex" xmlns:w16du="http://schemas.microsoft.com/office/word/2023/wordml/word16du" mc:Ignorable="w14 w15 w16se w16cid w16 w16cex w16sdtdh w16sdtfl w16du">
   <w:docDefaults>
     <w:rPrDefault>
       <w:rPr>

</xml_diff>

<commit_message>
minor spelling on the report
</commit_message>
<xml_diff>
--- a/report.docx
+++ b/report.docx
@@ -948,15 +948,13 @@
         </w:rPr>
         <w:t xml:space="preserve">: this test the enqueue and dequeue </w:t>
       </w:r>
-      <w:proofErr w:type="spellStart"/>
-      <w:r>
-        <w:rPr>
-          <w:rFonts w:cs="AppleSystemUIFont"/>
-          <w:kern w:val="0"/>
-        </w:rPr>
-        <w:t>behavior</w:t>
-      </w:r>
-      <w:proofErr w:type="spellEnd"/>
+      <w:r>
+        <w:rPr>
+          <w:rFonts w:cs="AppleSystemUIFont"/>
+          <w:kern w:val="0"/>
+        </w:rPr>
+        <w:t>behaviour</w:t>
+      </w:r>
       <w:r>
         <w:rPr>
           <w:rFonts w:cs="AppleSystemUIFont"/>
@@ -1224,15 +1222,13 @@
         </w:rPr>
         <w:t xml:space="preserve">To satisfy the specification for this project we needed to produce a multithreaded card game, supported by a suite of tests and documentation. We satisfied the multithreading requirement by creating a separate thread for each player with a synchronized draw and discard method ensure that each draw and discard is an atomic action which cannot be interrupted. The game follows the required ring structure with each player drawing from and discarding to the correct decks with each deck operating as a FIFO queue. Each player is dealt the correct number of cards and preferers cards which match their player number. To prevent the game stagnating the player hand also operates like a queue with cards removed from the front and added to the back. The game takes the number of players and input text file in the console and then outputs the required player and deck information to the correct output files. These </w:t>
       </w:r>
-      <w:proofErr w:type="spellStart"/>
-      <w:r>
-        <w:rPr>
-          <w:rFonts w:cs="AppleSystemUIFont"/>
-          <w:kern w:val="0"/>
-        </w:rPr>
-        <w:t>behaviors</w:t>
-      </w:r>
-      <w:proofErr w:type="spellEnd"/>
+      <w:r>
+        <w:rPr>
+          <w:rFonts w:cs="AppleSystemUIFont"/>
+          <w:kern w:val="0"/>
+        </w:rPr>
+        <w:t>behaviours</w:t>
+      </w:r>
       <w:r>
         <w:rPr>
           <w:rFonts w:cs="AppleSystemUIFont"/>
@@ -1247,186 +1243,6 @@
         </w:rPr>
         <w:t>.</w:t>
       </w:r>
-    </w:p>
-    <w:p>
-      <w:pPr>
-        <w:rPr>
-          <w:b/>
-          <w:bCs/>
-          <w:sz w:val="28"/>
-          <w:szCs w:val="28"/>
-          <w:u w:val="single"/>
-          <w:lang w:val="en-US"/>
-        </w:rPr>
-      </w:pPr>
-    </w:p>
-    <w:p>
-      <w:pPr>
-        <w:rPr>
-          <w:b/>
-          <w:bCs/>
-          <w:sz w:val="28"/>
-          <w:szCs w:val="28"/>
-          <w:u w:val="single"/>
-          <w:lang w:val="en-US"/>
-        </w:rPr>
-      </w:pPr>
-    </w:p>
-    <w:p>
-      <w:pPr>
-        <w:rPr>
-          <w:b/>
-          <w:bCs/>
-          <w:sz w:val="28"/>
-          <w:szCs w:val="28"/>
-          <w:u w:val="single"/>
-          <w:lang w:val="en-US"/>
-        </w:rPr>
-      </w:pPr>
-    </w:p>
-    <w:p>
-      <w:pPr>
-        <w:rPr>
-          <w:b/>
-          <w:bCs/>
-          <w:sz w:val="28"/>
-          <w:szCs w:val="28"/>
-          <w:u w:val="single"/>
-          <w:lang w:val="en-US"/>
-        </w:rPr>
-      </w:pPr>
-    </w:p>
-    <w:p>
-      <w:pPr>
-        <w:rPr>
-          <w:b/>
-          <w:bCs/>
-          <w:sz w:val="28"/>
-          <w:szCs w:val="28"/>
-          <w:u w:val="single"/>
-          <w:lang w:val="en-US"/>
-        </w:rPr>
-      </w:pPr>
-    </w:p>
-    <w:p>
-      <w:pPr>
-        <w:rPr>
-          <w:b/>
-          <w:bCs/>
-          <w:sz w:val="28"/>
-          <w:szCs w:val="28"/>
-          <w:u w:val="single"/>
-          <w:lang w:val="en-US"/>
-        </w:rPr>
-      </w:pPr>
-    </w:p>
-    <w:p>
-      <w:pPr>
-        <w:rPr>
-          <w:b/>
-          <w:bCs/>
-          <w:sz w:val="28"/>
-          <w:szCs w:val="28"/>
-          <w:u w:val="single"/>
-          <w:lang w:val="en-US"/>
-        </w:rPr>
-      </w:pPr>
-    </w:p>
-    <w:p>
-      <w:pPr>
-        <w:rPr>
-          <w:b/>
-          <w:bCs/>
-          <w:sz w:val="28"/>
-          <w:szCs w:val="28"/>
-          <w:u w:val="single"/>
-          <w:lang w:val="en-US"/>
-        </w:rPr>
-      </w:pPr>
-    </w:p>
-    <w:p>
-      <w:pPr>
-        <w:rPr>
-          <w:b/>
-          <w:bCs/>
-          <w:sz w:val="28"/>
-          <w:szCs w:val="28"/>
-          <w:u w:val="single"/>
-          <w:lang w:val="en-US"/>
-        </w:rPr>
-      </w:pPr>
-    </w:p>
-    <w:p>
-      <w:pPr>
-        <w:rPr>
-          <w:b/>
-          <w:bCs/>
-          <w:sz w:val="28"/>
-          <w:szCs w:val="28"/>
-          <w:u w:val="single"/>
-          <w:lang w:val="en-US"/>
-        </w:rPr>
-      </w:pPr>
-    </w:p>
-    <w:p>
-      <w:pPr>
-        <w:rPr>
-          <w:b/>
-          <w:bCs/>
-          <w:sz w:val="28"/>
-          <w:szCs w:val="28"/>
-          <w:u w:val="single"/>
-          <w:lang w:val="en-US"/>
-        </w:rPr>
-      </w:pPr>
-    </w:p>
-    <w:p>
-      <w:pPr>
-        <w:rPr>
-          <w:b/>
-          <w:bCs/>
-          <w:sz w:val="28"/>
-          <w:szCs w:val="28"/>
-          <w:u w:val="single"/>
-          <w:lang w:val="en-US"/>
-        </w:rPr>
-      </w:pPr>
-    </w:p>
-    <w:p>
-      <w:pPr>
-        <w:rPr>
-          <w:b/>
-          <w:bCs/>
-          <w:sz w:val="28"/>
-          <w:szCs w:val="28"/>
-          <w:u w:val="single"/>
-          <w:lang w:val="en-US"/>
-        </w:rPr>
-      </w:pPr>
-    </w:p>
-    <w:p>
-      <w:pPr>
-        <w:rPr>
-          <w:b/>
-          <w:bCs/>
-          <w:sz w:val="28"/>
-          <w:szCs w:val="28"/>
-          <w:u w:val="single"/>
-          <w:lang w:val="en-US"/>
-        </w:rPr>
-      </w:pPr>
-    </w:p>
-    <w:p>
-      <w:pPr>
-        <w:rPr>
-          <w:b/>
-          <w:bCs/>
-          <w:sz w:val="28"/>
-          <w:szCs w:val="28"/>
-          <w:u w:val="single"/>
-          <w:lang w:val="en-US"/>
-        </w:rPr>
-      </w:pPr>
     </w:p>
     <w:p>
       <w:pPr>

</xml_diff>